<commit_message>
Corrige ap de Wilson (canasto de cangrejos) y añade Contemporary Archipelagic Thinking a metodología ES/EN
</commit_message>
<xml_diff>
--- a/documentacion/Propuesta Cajamag.docx
+++ b/documentacion/Propuesta Cajamag.docx
@@ -19,7 +19,7 @@
           <w:noProof/>
         </w:rPr>
         <w:drawing>
-          <wp:inline distT="0" distB="0" distL="0" distR="0" wp14:anchorId="7892EE7F" wp14:editId="093BB99A">
+          <wp:inline distT="0" distB="0" distL="0" distR="0" wp14:anchorId="7892EE7F" wp14:editId="664F7CA6">
             <wp:extent cx="2303294" cy="1941830"/>
             <wp:effectExtent l="0" t="0" r="0" b="1270"/>
             <wp:docPr id="1507389675" name="Imagen 1"/>
@@ -123,6 +123,13 @@
           <w:b/>
           <w:bCs/>
         </w:rPr>
+        <w:t xml:space="preserve">Taller: </w:t>
+      </w:r>
+      <w:r>
+        <w:rPr>
+          <w:b/>
+          <w:bCs/>
+        </w:rPr>
         <w:t>Humanidades digitales desde el Caribe colombiano</w:t>
       </w:r>
     </w:p>
@@ -133,13 +140,7 @@
         <w:jc w:val="both"/>
       </w:pPr>
       <w:r>
-        <w:t xml:space="preserve">Esta </w:t>
-      </w:r>
-      <w:r>
-        <w:t xml:space="preserve">conferencia </w:t>
-      </w:r>
-      <w:r>
-        <w:t xml:space="preserve">explora el potencial de las humanidades digitales cuando se piensan y se diseñan desde nuestra propia orilla: Santa Marta y el Caribe colombiano. A partir de la experiencia de Pensamiento Caribe, y particularmente de los proyectos </w:t>
+        <w:t xml:space="preserve">Esta conferencia explora el potencial de las humanidades digitales cuando se piensan y se diseñan desde nuestra propia orilla: Santa Marta y el Caribe colombiano. A partir de la experiencia de Pensamiento Caribe, y particularmente de los proyectos </w:t>
       </w:r>
       <w:r>
         <w:rPr>
@@ -774,6 +775,7 @@
   <w:style w:type="character" w:default="1" w:styleId="Fuentedeprrafopredeter">
     <w:name w:val="Default Paragraph Font"/>
     <w:uiPriority w:val="1"/>
+    <w:semiHidden/>
     <w:unhideWhenUsed/>
   </w:style>
   <w:style w:type="table" w:default="1" w:styleId="Tablanormal">

</xml_diff>